<commit_message>
Fix: proteccion de datos al subir evidencias multiples, bloqueo de ancho de columnas en Word, correccion de lectura de actividades en Summernote y ajuste contextual en conjugacion de verbos
</commit_message>
<xml_diff>
--- a/src/main/webapp/plantillas/INFORME_GESTION_TEMPLATE_BORRADOR.docx
+++ b/src/main/webapp/plantillas/INFORME_GESTION_TEMPLATE_BORRADOR.docx
@@ -8,8 +8,6 @@
           <w:rFonts w:ascii="Arial" w:eastAsia="Arial" w:hAnsi="Arial" w:cs="Arial"/>
         </w:rPr>
       </w:pPr>
-      <w:bookmarkStart w:id="0" w:name="_GoBack"/>
-      <w:bookmarkEnd w:id="0"/>
     </w:p>
     <w:tbl>
       <w:tblPr>
@@ -189,6 +187,11 @@
               </w:rPr>
             </w:pPr>
             <w:r>
+              <w:rPr>
+                <w:rFonts w:ascii="Arial" w:hAnsi="Arial" w:cs="Arial"/>
+                <w:sz w:val="22"/>
+                <w:szCs w:val="22"/>
+              </w:rPr>
               <w:t xml:space="preserve">Fecha de Suscripción del Informe </w:t>
             </w:r>
           </w:p>
@@ -220,6 +223,8 @@
               </w:rPr>
               <w:t>${FECHA_INFORME}</w:t>
             </w:r>
+            <w:bookmarkStart w:id="0" w:name="_GoBack"/>
+            <w:bookmarkEnd w:id="0"/>
           </w:p>
         </w:tc>
       </w:tr>
@@ -6735,7 +6740,7 @@
 </file>
 
 <file path=customXml/itemProps1.xml><?xml version="1.0" encoding="utf-8"?>
-<ds:datastoreItem xmlns:ds="http://schemas.openxmlformats.org/officeDocument/2006/customXml" ds:itemID="{8A61B5F3-A79E-4235-A12C-BACF9F34AE38}">
+<ds:datastoreItem xmlns:ds="http://schemas.openxmlformats.org/officeDocument/2006/customXml" ds:itemID="{49C34AF7-24FB-4B02-8EF3-1700B5D55EE9}">
   <ds:schemaRefs>
     <ds:schemaRef ds:uri="http://schemas.openxmlformats.org/officeDocument/2006/bibliography"/>
   </ds:schemaRefs>

</xml_diff>